<commit_message>
Remove to-be-written markers from styled thesis
Co-Authored-By: Claude Opus 5.5 <noreply@anthropic.com>
Claude-Session: https://claude.ai/code/session_01UunSGkA7xxcu1ZJiDN1zG2
</commit_message>
<xml_diff>
--- a/output/卒論_修正版_文化を楽しむ力_原稿スタイル.docx
+++ b/output/卒論_修正版_文化を楽しむ力_原稿スタイル.docx
@@ -467,17 +467,6 @@
         </w:rPr>
         <w:t xml:space="preserve">5．結果</w:t>
       </w:r>
-      <w:r>
-        <w:rPr>
-          <w:rFonts w:ascii="游明朝" w:cs="游明朝" w:eastAsia="游明朝" w:hAnsi="游明朝"/>
-          <w:b/>
-          <w:bCs/>
-          <w:color w:val="FF0000"/>
-          <w:sz w:val="21"/>
-          <w:szCs w:val="21"/>
-        </w:rPr>
-        <w:t xml:space="preserve">【執筆予定】</w:t>
-      </w:r>
     </w:p>
     <w:p>
       <w:pPr>
@@ -548,17 +537,6 @@
         </w:rPr>
         <w:t xml:space="preserve">6．考察</w:t>
       </w:r>
-      <w:r>
-        <w:rPr>
-          <w:rFonts w:ascii="游明朝" w:cs="游明朝" w:eastAsia="游明朝" w:hAnsi="游明朝"/>
-          <w:b/>
-          <w:bCs/>
-          <w:color w:val="FF0000"/>
-          <w:sz w:val="21"/>
-          <w:szCs w:val="21"/>
-        </w:rPr>
-        <w:t xml:space="preserve">【執筆予定】</w:t>
-      </w:r>
     </w:p>
     <w:p>
       <w:pPr>
@@ -628,17 +606,6 @@
           <w:szCs w:val="21"/>
         </w:rPr>
         <w:t xml:space="preserve">7．結論</w:t>
-      </w:r>
-      <w:r>
-        <w:rPr>
-          <w:rFonts w:ascii="游明朝" w:cs="游明朝" w:eastAsia="游明朝" w:hAnsi="游明朝"/>
-          <w:b/>
-          <w:bCs/>
-          <w:color w:val="FF0000"/>
-          <w:sz w:val="21"/>
-          <w:szCs w:val="21"/>
-        </w:rPr>
-        <w:t xml:space="preserve">【執筆予定】</w:t>
       </w:r>
     </w:p>
     <w:p>
@@ -804,20 +771,6 @@
       </w:pPr>
       <w:r>
         <w:t xml:space="preserve">しかしある時点で「何とかなる」という気持ちに切り替え、自分から動くようになった。現地の学生と会話を重ね、ホストファミリーからカルダモンやターメリックなどスパイスの効能を教わり、自分でも配合を試した。こうした試みを自作の「やったことリスト」に記録していくうちに、困惑は薄れ、次第に楽しさが芽生えた。</w:t>
-      </w:r>
-    </w:p>
-    <w:p>
-      <w:pPr>
-        <w:spacing w:after="120" w:line="360"/>
-        <w:ind w:firstLine="210"/>
-      </w:pPr>
-      <w:r>
-        <w:rPr>
-          <w:b/>
-          <w:bCs/>
-          <w:color w:val="FF0000"/>
-        </w:rPr>
-        <w:t xml:space="preserve">【執筆予定：ベトナムでの経験（時期・期間・戸惑ったこと・フィジーとの違い）を2〜3文で追加】</w:t>
       </w:r>
     </w:p>
     <w:p>
@@ -4783,16 +4736,6 @@
         </w:rPr>
         <w:t xml:space="preserve">5．結果</w:t>
       </w:r>
-      <w:r>
-        <w:rPr>
-          <w:b/>
-          <w:bCs/>
-          <w:color w:val="FF0000"/>
-          <w:sz w:val="32"/>
-          <w:szCs w:val="32"/>
-        </w:rPr>
-        <w:t xml:space="preserve">【執筆予定】</w:t>
-      </w:r>
     </w:p>
     <w:p>
       <w:pPr>
@@ -5014,16 +4957,6 @@
         </w:rPr>
         <w:t xml:space="preserve">6．考察</w:t>
       </w:r>
-      <w:r>
-        <w:rPr>
-          <w:b/>
-          <w:bCs/>
-          <w:color w:val="FF0000"/>
-          <w:sz w:val="32"/>
-          <w:szCs w:val="32"/>
-        </w:rPr>
-        <w:t xml:space="preserve">【執筆予定】</w:t>
-      </w:r>
     </w:p>
     <w:p>
       <w:pPr>
@@ -5128,16 +5061,6 @@
           <w:szCs w:val="32"/>
         </w:rPr>
         <w:t xml:space="preserve">7．結論</w:t>
-      </w:r>
-      <w:r>
-        <w:rPr>
-          <w:b/>
-          <w:bCs/>
-          <w:color w:val="FF0000"/>
-          <w:sz w:val="32"/>
-          <w:szCs w:val="32"/>
-        </w:rPr>
-        <w:t xml:space="preserve">【執筆予定】</w:t>
       </w:r>
     </w:p>
     <w:p>

</xml_diff>

<commit_message>
Add Vietnam study period (1 year)
Co-Authored-By: Claude Opus 5.5 <noreply@anthropic.com>
Claude-Session: https://claude.ai/code/session_01UunSGkA7xxcu1ZJiDN1zG2
</commit_message>
<xml_diff>
--- a/output/卒論_修正版_文化を楽しむ力_原稿スタイル.docx
+++ b/output/卒論_修正版_文化を楽しむ力_原稿スタイル.docx
@@ -3849,18 +3849,7 @@
         <w:ind w:firstLine="210"/>
       </w:pPr>
       <w:r>
-        <w:t xml:space="preserve">フィジー（3年間）とベトナム</w:t>
-      </w:r>
-      <w:r>
-        <w:rPr>
-          <w:b/>
-          <w:bCs/>
-          <w:color w:val="FF0000"/>
-        </w:rPr>
-        <w:t xml:space="preserve">【期間を記入】</w:t>
-      </w:r>
-      <w:r>
-        <w:t xml:space="preserve">での筆者の経験を、「やったことリスト」や当時の写真・日記・SNSなどの記録を手がかりに振り返る。衝突の一つひとつについて、下のアンケートと同じ項目で書き出し、第3章の表（3.4）にまとめる。</w:t>
+        <w:t xml:space="preserve">フィジー（3年間）とベトナム（1年間）での筆者の経験を、「やったことリスト」や当時の写真・日記・SNSなどの記録を手がかりに振り返る。衝突の一つひとつについて、下のアンケートと同じ項目で書き出し、第3章の表（3.4）にまとめる。</w:t>
       </w:r>
     </w:p>
     <w:p>

</xml_diff>

<commit_message>
Align purpose, research question, and definition
Co-Authored-By: Claude Opus 5.5 <noreply@anthropic.com>
Claude-Session: https://claude.ai/code/session_01UunSGkA7xxcu1ZJiDN1zG2
</commit_message>
<xml_diff>
--- a/output/卒論_修正版_文化を楽しむ力_原稿スタイル.docx
+++ b/output/卒論_修正版_文化を楽しむ力_原稿スタイル.docx
@@ -802,7 +802,7 @@
         <w:ind w:firstLine="210"/>
       </w:pPr>
       <w:r>
-        <w:t xml:space="preserve">留学者の多くが「戸惑い→衝突→適応→楽しさ」という段階をたどると言われる。しかし従来の調査は、一時点の適応度を数値で測る量的研究が中心である。過程全体を追い、特に「適応」の先にある「楽しさ」への転換を扱った質的研究は少ない。</w:t>
+        <w:t xml:space="preserve">留学者の多くが「戸惑い→衝突→適応→楽しさ」という段階をたどると言われる。しかし従来の調査は、一時点の適応度を数値で測る量的研究が中心である。過程全体を追い、衝突をどう乗り越えたのか、乗り越えられなかったときにどう向き合ったのかまでを扱った質的研究は少ない。</w:t>
       </w:r>
     </w:p>
     <w:p>
@@ -811,7 +811,7 @@
         <w:ind w:firstLine="210"/>
       </w:pPr>
       <w:r>
-        <w:t xml:space="preserve">そこで本研究は、次の問いに答えることを目的とする。</w:t>
+        <w:t xml:space="preserve">そこで本研究は、異文化の衝突を人はどう乗り越えるのか（乗り越えられないときはどう向き合うのか）を明らかにし、これから留学する人が使えるヒントを示すことを目的とする。そのために、次の問いを立てる。</w:t>
       </w:r>
     </w:p>
     <w:p>
@@ -830,7 +830,7 @@
         <w:t xml:space="preserve">リサーチクエスチョン</w:t>
       </w:r>
       <w:r>
-        <w:t xml:space="preserve">：留学経験者は、カルチャーショックによる戸惑いを、どのような気づきと行動的工夫を通して「楽しさ」へと転換していくのか。</w:t>
+        <w:t xml:space="preserve">：留学経験者は、異文化の衝突をどのような気づきと行動的工夫によって乗り越えるのか。また、乗り越えられない衝突とはどのように向き合うのか。</w:t>
       </w:r>
     </w:p>
     <w:p>
@@ -909,7 +909,7 @@
         <w:t xml:space="preserve">事例研究</w:t>
       </w:r>
       <w:r>
-        <w:t xml:space="preserve">である。そこに他の留学経験者へのアンケートを加え、個人の経験を超えた共通点を見出す。最終的には、これから留学する人が自分の衝突を乗り越えるときに使えるヒントを示すことを目指す。</w:t>
+        <w:t xml:space="preserve">である。そこに他の留学経験者へのアンケートを加え、個人の経験を超えた共通点を見出す。その共通点から、これから留学する人へのヒントをまとめる。</w:t>
       </w:r>
     </w:p>
     <w:p>
@@ -2212,7 +2212,7 @@
         <w:t xml:space="preserve">文化を楽しむ力</w:t>
       </w:r>
       <w:r>
-        <w:t xml:space="preserve">：異文化との違いによる違和感を、自らの気づきと行動によって「興味」や「喜び」に変えていく力。</w:t>
+        <w:t xml:space="preserve">：全部を好きになる力ではなく、受け入れられない違いがあっても、自分なりの向き合い方を見つけて異文化の中で過ごせる力。</w:t>
       </w:r>
     </w:p>
     <w:p>
@@ -2221,7 +2221,7 @@
         <w:ind w:firstLine="210"/>
       </w:pPr>
       <w:r>
-        <w:t xml:space="preserve">この力は、単に違いを「受け入れる」こと（適応）とは区別される。ショック期や調整期の経験があってこそ育つものであり、異文化経験の到達点と位置づける。</w:t>
+        <w:t xml:space="preserve">この力には、違いを「楽しむ」ことだけでなく、「受け入れる」「尊重して距離を取る」といった向き合い方も含まれる。「楽しむ」は乗り越えた先にありうる結果の一つであり、「楽しめなかった」経験も、この力が育つ過程の一部として扱う。</w:t>
       </w:r>
       <w:r>
         <w:rPr>

</xml_diff>